<commit_message>
feat: add swipe feed and relevant open media
</commit_message>
<xml_diff>
--- a/documentation/technical-specification-module-1.docx
+++ b/documentation/technical-specification-module-1.docx
@@ -912,52 +912,55 @@
     <w:p>
       <w:pPr>
         <w:spacing w:after="0" w:line="360" w:lineRule="auto"/>
-        <w:jc w:val="both"/>
-        <w:rPr>
-          <w:rFonts w:ascii="Times New Roman" w:hAnsi="Times New Roman" w:cs="Times New Roman"/>
-          <w:sz w:val="28"/>
-        </w:rPr>
-      </w:pPr>
-      <w:r>
-        <w:rPr>
-          <w:rFonts w:ascii="Times New Roman" w:hAnsi="Times New Roman" w:cs="Times New Roman"/>
-          <w:sz w:val="28"/>
-        </w:rPr>
-        <w:t>вЂў GET /artwork-excerpts/feed/:id?next=true — открыть опубликованный отрывок по идентификатору; при next=true открыть следующий опубликованный отрывок;</w:t>
-      </w:r>
-    </w:p>
-    <w:p>
-      <w:pPr>
-        <w:spacing w:after="0" w:line="360" w:lineRule="auto"/>
-        <w:jc w:val="both"/>
-        <w:rPr>
-          <w:rFonts w:ascii="Times New Roman" w:hAnsi="Times New Roman" w:cs="Times New Roman"/>
-          <w:sz w:val="28"/>
-        </w:rPr>
-      </w:pPr>
-      <w:r>
-        <w:rPr>
-          <w:rFonts w:ascii="Times New Roman" w:hAnsi="Times New Roman" w:cs="Times New Roman"/>
-          <w:sz w:val="28"/>
-        </w:rPr>
-        <w:t>вЂў GET /artwork-excerpts/draft — получить единственный отрывок со статусом draft для страницы добавления без сохранения;</w:t>
-      </w:r>
-    </w:p>
-    <w:p>
-      <w:pPr>
-        <w:spacing w:after="0" w:line="360" w:lineRule="auto"/>
-        <w:jc w:val="both"/>
-        <w:rPr>
-          <w:rFonts w:ascii="Times New Roman" w:hAnsi="Times New Roman" w:cs="Times New Roman"/>
-          <w:sz w:val="28"/>
-        </w:rPr>
-      </w:pPr>
-      <w:r>
-        <w:rPr>
-          <w:rFonts w:ascii="Times New Roman" w:hAnsi="Times New Roman" w:cs="Times New Roman"/>
-          <w:sz w:val="28"/>
-        </w:rPr>
-        <w:t>вЂў GET /artwork-excerpts?publicationYear=... — получить плитку опубликованных отрывков с необязательной серверной фильтрацией по году публикации.</w:t>
+        <w:ind w:left="709"/>
+        <w:jc w:val="both"/>
+        <w:rPr>
+          <w:rFonts w:ascii="Times New Roman" w:hAnsi="Times New Roman" w:cs="Times New Roman"/>
+          <w:sz w:val="28"/>
+        </w:rPr>
+      </w:pPr>
+      <w:r>
+        <w:rPr>
+          <w:rFonts w:ascii="Times New Roman" w:hAnsi="Times New Roman" w:cs="Times New Roman"/>
+          <w:sz w:val="28"/>
+        </w:rPr>
+        <w:t>• GET /artwork-excerpts/feed/:id?next=true — открыть опубликованный отрывок по идентификатору; при next=true открыть следующий опубликованный отрывок;</w:t>
+      </w:r>
+    </w:p>
+    <w:p>
+      <w:pPr>
+        <w:spacing w:after="0" w:line="360" w:lineRule="auto"/>
+        <w:ind w:left="709"/>
+        <w:jc w:val="both"/>
+        <w:rPr>
+          <w:rFonts w:ascii="Times New Roman" w:hAnsi="Times New Roman" w:cs="Times New Roman"/>
+          <w:sz w:val="28"/>
+        </w:rPr>
+      </w:pPr>
+      <w:r>
+        <w:rPr>
+          <w:rFonts w:ascii="Times New Roman" w:hAnsi="Times New Roman" w:cs="Times New Roman"/>
+          <w:sz w:val="28"/>
+        </w:rPr>
+        <w:t>• GET /artwork-excerpts/draft — получить единственный отрывок со статусом draft для страницы добавления без сохранения;</w:t>
+      </w:r>
+    </w:p>
+    <w:p>
+      <w:pPr>
+        <w:spacing w:after="0" w:line="360" w:lineRule="auto"/>
+        <w:ind w:left="709"/>
+        <w:jc w:val="both"/>
+        <w:rPr>
+          <w:rFonts w:ascii="Times New Roman" w:hAnsi="Times New Roman" w:cs="Times New Roman"/>
+          <w:sz w:val="28"/>
+        </w:rPr>
+      </w:pPr>
+      <w:r>
+        <w:rPr>
+          <w:rFonts w:ascii="Times New Roman" w:hAnsi="Times New Roman" w:cs="Times New Roman"/>
+          <w:sz w:val="28"/>
+        </w:rPr>
+        <w:t>• GET /artwork-excerpts?publicationYear=... — получить плитку опубликованных отрывков с необязательной серверной фильтрацией по году публикации.</w:t>
       </w:r>
     </w:p>
     <w:p>
@@ -1653,7 +1656,7 @@
           <w:rFonts w:ascii="Times New Roman" w:hAnsi="Times New Roman" w:cs="Times New Roman"/>
           <w:sz w:val="28"/>
         </w:rPr>
-        <w:t>4.6.4. Кнопка «Следующий» должна отправлять GET-запрос с параметром next=true и открывать следующий опубликованный отрывок.</w:t>
+        <w:t>4.6.4. Лента должна переключаться вертикальным свайпом или прокруткой с фиксацией на следующей карточке. Обязательная кнопка «Следующий» дополнительно отправляет GET-запрос с параметром next=true и открывает следующий опубликованный отрывок.</w:t>
       </w:r>
     </w:p>
     <w:p>
@@ -2322,17 +2325,6 @@
         </w:rPr>
         <w:t>6.6. Точные номера версий необходимо перенести из фактически зафиксированных package.json, lock-файла и docker-compose.yml; указывать непроверенные номера версий в окончательном ТЗ нельзя.</w:t>
       </w:r>
-    </w:p>
-    <w:p>
-      <w:pPr>
-        <w:spacing w:after="0" w:line="360" w:lineRule="auto"/>
-        <w:ind w:firstLine="709"/>
-        <w:jc w:val="both"/>
-        <w:rPr>
-          <w:rFonts w:ascii="Times New Roman" w:hAnsi="Times New Roman" w:cs="Times New Roman"/>
-          <w:sz w:val="28"/>
-        </w:rPr>
-      </w:pPr>
     </w:p>
     <w:p>
       <w:pPr>
@@ -2761,7 +2753,7 @@
     <w:link w:val="10"/>
     <w:uiPriority w:val="9"/>
     <w:qFormat/>
-    <w:rsid w:val="00832CA8"/>
+    <w:rsid w:val="00245757"/>
     <w:pPr>
       <w:keepNext/>
       <w:keepLines/>
@@ -2784,7 +2776,7 @@
     <w:semiHidden/>
     <w:unhideWhenUsed/>
     <w:qFormat/>
-    <w:rsid w:val="00832CA8"/>
+    <w:rsid w:val="00245757"/>
     <w:pPr>
       <w:keepNext/>
       <w:keepLines/>
@@ -2807,7 +2799,7 @@
     <w:semiHidden/>
     <w:unhideWhenUsed/>
     <w:qFormat/>
-    <w:rsid w:val="00832CA8"/>
+    <w:rsid w:val="00245757"/>
     <w:pPr>
       <w:keepNext/>
       <w:keepLines/>
@@ -2830,7 +2822,7 @@
     <w:semiHidden/>
     <w:unhideWhenUsed/>
     <w:qFormat/>
-    <w:rsid w:val="00832CA8"/>
+    <w:rsid w:val="00245757"/>
     <w:pPr>
       <w:keepNext/>
       <w:keepLines/>
@@ -2853,7 +2845,7 @@
     <w:semiHidden/>
     <w:unhideWhenUsed/>
     <w:qFormat/>
-    <w:rsid w:val="00832CA8"/>
+    <w:rsid w:val="00245757"/>
     <w:pPr>
       <w:keepNext/>
       <w:keepLines/>
@@ -2874,7 +2866,7 @@
     <w:semiHidden/>
     <w:unhideWhenUsed/>
     <w:qFormat/>
-    <w:rsid w:val="00832CA8"/>
+    <w:rsid w:val="00245757"/>
     <w:pPr>
       <w:keepNext/>
       <w:keepLines/>
@@ -2897,7 +2889,7 @@
     <w:semiHidden/>
     <w:unhideWhenUsed/>
     <w:qFormat/>
-    <w:rsid w:val="00832CA8"/>
+    <w:rsid w:val="00245757"/>
     <w:pPr>
       <w:keepNext/>
       <w:keepLines/>
@@ -2918,7 +2910,7 @@
     <w:semiHidden/>
     <w:unhideWhenUsed/>
     <w:qFormat/>
-    <w:rsid w:val="00832CA8"/>
+    <w:rsid w:val="00245757"/>
     <w:pPr>
       <w:keepNext/>
       <w:keepLines/>
@@ -2941,7 +2933,7 @@
     <w:semiHidden/>
     <w:unhideWhenUsed/>
     <w:qFormat/>
-    <w:rsid w:val="00832CA8"/>
+    <w:rsid w:val="00245757"/>
     <w:pPr>
       <w:keepNext/>
       <w:keepLines/>
@@ -2985,7 +2977,7 @@
     <w:basedOn w:val="a0"/>
     <w:link w:val="1"/>
     <w:uiPriority w:val="9"/>
-    <w:rsid w:val="00832CA8"/>
+    <w:rsid w:val="00245757"/>
     <w:rPr>
       <w:rFonts w:asciiTheme="majorHAnsi" w:eastAsiaTheme="majorEastAsia" w:hAnsiTheme="majorHAnsi" w:cstheme="majorBidi"/>
       <w:color w:val="2F5496" w:themeColor="accent1" w:themeShade="BF"/>
@@ -2999,7 +2991,7 @@
     <w:link w:val="2"/>
     <w:uiPriority w:val="9"/>
     <w:semiHidden/>
-    <w:rsid w:val="00832CA8"/>
+    <w:rsid w:val="00245757"/>
     <w:rPr>
       <w:rFonts w:asciiTheme="majorHAnsi" w:eastAsiaTheme="majorEastAsia" w:hAnsiTheme="majorHAnsi" w:cstheme="majorBidi"/>
       <w:color w:val="2F5496" w:themeColor="accent1" w:themeShade="BF"/>
@@ -3013,7 +3005,7 @@
     <w:link w:val="3"/>
     <w:uiPriority w:val="9"/>
     <w:semiHidden/>
-    <w:rsid w:val="00832CA8"/>
+    <w:rsid w:val="00245757"/>
     <w:rPr>
       <w:rFonts w:eastAsiaTheme="majorEastAsia" w:cstheme="majorBidi"/>
       <w:color w:val="2F5496" w:themeColor="accent1" w:themeShade="BF"/>
@@ -3027,7 +3019,7 @@
     <w:link w:val="4"/>
     <w:uiPriority w:val="9"/>
     <w:semiHidden/>
-    <w:rsid w:val="00832CA8"/>
+    <w:rsid w:val="00245757"/>
     <w:rPr>
       <w:rFonts w:eastAsiaTheme="majorEastAsia" w:cstheme="majorBidi"/>
       <w:i/>
@@ -3041,7 +3033,7 @@
     <w:link w:val="5"/>
     <w:uiPriority w:val="9"/>
     <w:semiHidden/>
-    <w:rsid w:val="00832CA8"/>
+    <w:rsid w:val="00245757"/>
     <w:rPr>
       <w:rFonts w:eastAsiaTheme="majorEastAsia" w:cstheme="majorBidi"/>
       <w:color w:val="2F5496" w:themeColor="accent1" w:themeShade="BF"/>
@@ -3053,7 +3045,7 @@
     <w:link w:val="6"/>
     <w:uiPriority w:val="9"/>
     <w:semiHidden/>
-    <w:rsid w:val="00832CA8"/>
+    <w:rsid w:val="00245757"/>
     <w:rPr>
       <w:rFonts w:eastAsiaTheme="majorEastAsia" w:cstheme="majorBidi"/>
       <w:i/>
@@ -3067,7 +3059,7 @@
     <w:link w:val="7"/>
     <w:uiPriority w:val="9"/>
     <w:semiHidden/>
-    <w:rsid w:val="00832CA8"/>
+    <w:rsid w:val="00245757"/>
     <w:rPr>
       <w:rFonts w:eastAsiaTheme="majorEastAsia" w:cstheme="majorBidi"/>
       <w:color w:val="595959" w:themeColor="text1" w:themeTint="A6"/>
@@ -3079,7 +3071,7 @@
     <w:link w:val="8"/>
     <w:uiPriority w:val="9"/>
     <w:semiHidden/>
-    <w:rsid w:val="00832CA8"/>
+    <w:rsid w:val="00245757"/>
     <w:rPr>
       <w:rFonts w:eastAsiaTheme="majorEastAsia" w:cstheme="majorBidi"/>
       <w:i/>
@@ -3093,7 +3085,7 @@
     <w:link w:val="9"/>
     <w:uiPriority w:val="9"/>
     <w:semiHidden/>
-    <w:rsid w:val="00832CA8"/>
+    <w:rsid w:val="00245757"/>
     <w:rPr>
       <w:rFonts w:eastAsiaTheme="majorEastAsia" w:cstheme="majorBidi"/>
       <w:color w:val="272727" w:themeColor="text1" w:themeTint="D8"/>
@@ -3106,7 +3098,7 @@
     <w:link w:val="a4"/>
     <w:uiPriority w:val="10"/>
     <w:qFormat/>
-    <w:rsid w:val="00832CA8"/>
+    <w:rsid w:val="00245757"/>
     <w:pPr>
       <w:spacing w:after="80" w:line="240" w:lineRule="auto"/>
       <w:contextualSpacing/>
@@ -3124,7 +3116,7 @@
     <w:basedOn w:val="a0"/>
     <w:link w:val="a3"/>
     <w:uiPriority w:val="10"/>
-    <w:rsid w:val="00832CA8"/>
+    <w:rsid w:val="00245757"/>
     <w:rPr>
       <w:rFonts w:asciiTheme="majorHAnsi" w:eastAsiaTheme="majorEastAsia" w:hAnsiTheme="majorHAnsi" w:cstheme="majorBidi"/>
       <w:spacing w:val="-10"/>
@@ -3140,7 +3132,7 @@
     <w:link w:val="a6"/>
     <w:uiPriority w:val="11"/>
     <w:qFormat/>
-    <w:rsid w:val="00832CA8"/>
+    <w:rsid w:val="00245757"/>
     <w:pPr>
       <w:numPr>
         <w:ilvl w:val="1"/>
@@ -3159,7 +3151,7 @@
     <w:basedOn w:val="a0"/>
     <w:link w:val="a5"/>
     <w:uiPriority w:val="11"/>
-    <w:rsid w:val="00832CA8"/>
+    <w:rsid w:val="00245757"/>
     <w:rPr>
       <w:rFonts w:eastAsiaTheme="majorEastAsia" w:cstheme="majorBidi"/>
       <w:color w:val="595959" w:themeColor="text1" w:themeTint="A6"/>
@@ -3175,7 +3167,7 @@
     <w:link w:val="22"/>
     <w:uiPriority w:val="29"/>
     <w:qFormat/>
-    <w:rsid w:val="00832CA8"/>
+    <w:rsid w:val="00245757"/>
     <w:pPr>
       <w:spacing w:before="160"/>
       <w:jc w:val="center"/>
@@ -3191,7 +3183,7 @@
     <w:basedOn w:val="a0"/>
     <w:link w:val="21"/>
     <w:uiPriority w:val="29"/>
-    <w:rsid w:val="00832CA8"/>
+    <w:rsid w:val="00245757"/>
     <w:rPr>
       <w:i/>
       <w:iCs/>
@@ -3203,7 +3195,7 @@
     <w:basedOn w:val="a"/>
     <w:uiPriority w:val="34"/>
     <w:qFormat/>
-    <w:rsid w:val="00832CA8"/>
+    <w:rsid w:val="00245757"/>
     <w:pPr>
       <w:ind w:left="720"/>
       <w:contextualSpacing/>
@@ -3214,7 +3206,7 @@
     <w:basedOn w:val="a0"/>
     <w:uiPriority w:val="21"/>
     <w:qFormat/>
-    <w:rsid w:val="00832CA8"/>
+    <w:rsid w:val="00245757"/>
     <w:rPr>
       <w:i/>
       <w:iCs/>
@@ -3228,7 +3220,7 @@
     <w:link w:val="aa"/>
     <w:uiPriority w:val="30"/>
     <w:qFormat/>
-    <w:rsid w:val="00832CA8"/>
+    <w:rsid w:val="00245757"/>
     <w:pPr>
       <w:pBdr>
         <w:top w:val="single" w:sz="4" w:space="10" w:color="2F5496" w:themeColor="accent1" w:themeShade="BF"/>
@@ -3249,7 +3241,7 @@
     <w:basedOn w:val="a0"/>
     <w:link w:val="a9"/>
     <w:uiPriority w:val="30"/>
-    <w:rsid w:val="00832CA8"/>
+    <w:rsid w:val="00245757"/>
     <w:rPr>
       <w:i/>
       <w:iCs/>
@@ -3261,7 +3253,7 @@
     <w:basedOn w:val="a0"/>
     <w:uiPriority w:val="32"/>
     <w:qFormat/>
-    <w:rsid w:val="00832CA8"/>
+    <w:rsid w:val="00245757"/>
     <w:rPr>
       <w:b/>
       <w:bCs/>

</xml_diff>